<commit_message>
feat: harmonize pricing logic, dynamic shelter label, and auxiliary other items
</commit_message>
<xml_diff>
--- a/templates/MASTER_TEMPLATE_VFINAL.docx
+++ b/templates/MASTER_TEMPLATE_VFINAL.docx
@@ -2853,14 +2853,17 @@
         <w:rPr>
           <w:rFonts w:ascii="Times New Roman" w:hAnsi="Times New Roman"/>
           <w:b/>
-          <w:sz w:val="28"/>
-          <w:szCs w:val="28"/>
-          <w:lang w:val="vi-VN"/>
-        </w:rPr>
-      </w:pPr>
-      <w:r>
-        <w:rPr>
-          <w:rFonts w:ascii="Times New Roman" w:hAnsi="Times New Roman"/>
+          <w:bCs/>
+          <w:sz w:val="28"/>
+          <w:szCs w:val="28"/>
+          <w:lang w:val="vi-VN"/>
+        </w:rPr>
+      </w:pPr>
+      <w:r>
+        <w:rPr>
+          <w:rFonts w:ascii="Times New Roman" w:hAnsi="Times New Roman"/>
+          <w:b/>
+          <w:bCs/>
           <w:sz w:val="28"/>
         </w:rPr>
         <w:t xml:space="preserve">Một bên là: Ông/Bà {{OWNER_NAME}} (Gọi tắt là bên A) </w:t>

</xml_diff>

<commit_message>
Deploy Firebase and Refactor Performance
</commit_message>
<xml_diff>
--- a/templates/MASTER_TEMPLATE_VFINAL.docx
+++ b/templates/MASTER_TEMPLATE_VFINAL.docx
@@ -1,6 +1,6 @@
 
 <file path=word/document.xml><?xml version="1.0" encoding="utf-8"?>
-<w:document xmlns:wpc="http://schemas.microsoft.com/office/word/2010/wordprocessingCanvas" xmlns:cx="http://schemas.microsoft.com/office/drawing/2014/chartex" xmlns:cx1="http://schemas.microsoft.com/office/drawing/2015/9/8/chartex" xmlns:cx2="http://schemas.microsoft.com/office/drawing/2015/10/21/chartex" xmlns:cx3="http://schemas.microsoft.com/office/drawing/2016/5/9/chartex" xmlns:cx4="http://schemas.microsoft.com/office/drawing/2016/5/10/chartex" xmlns:cx5="http://schemas.microsoft.com/office/drawing/2016/5/11/chartex" xmlns:cx6="http://schemas.microsoft.com/office/drawing/2016/5/12/chartex" xmlns:cx7="http://schemas.microsoft.com/office/drawing/2016/5/13/chartex" xmlns:cx8="http://schemas.microsoft.com/office/drawing/2016/5/14/chartex" xmlns:mc="http://schemas.openxmlformats.org/markup-compatibility/2006" xmlns:aink="http://schemas.microsoft.com/office/drawing/2016/ink" xmlns:am3d="http://schemas.microsoft.com/office/drawing/2017/model3d" xmlns:o="urn:schemas-microsoft-com:office:office" xmlns:oel="http://schemas.microsoft.com/office/2019/extlst" xmlns:r="http://schemas.openxmlformats.org/officeDocument/2006/relationships" xmlns:m="http://schemas.openxmlformats.org/officeDocument/2006/math" xmlns:v="urn:schemas-microsoft-com:vml" xmlns:wp14="http://schemas.microsoft.com/office/word/2010/wordprocessingDrawing" xmlns:wp="http://schemas.openxmlformats.org/drawingml/2006/wordprocessingDrawing" xmlns:w10="urn:schemas-microsoft-com:office:word" xmlns:w="http://schemas.openxmlformats.org/wordprocessingml/2006/main" xmlns:w14="http://schemas.microsoft.com/office/word/2010/wordml" xmlns:w15="http://schemas.microsoft.com/office/word/2012/wordml" xmlns:w16cex="http://schemas.microsoft.com/office/word/2018/wordml/cex" xmlns:w16cid="http://schemas.microsoft.com/office/word/2016/wordml/cid" xmlns:w16="http://schemas.microsoft.com/office/word/2018/wordml" xmlns:w16du="http://schemas.microsoft.com/office/word/2023/wordml/word16du" xmlns:w16sdtdh="http://schemas.microsoft.com/office/word/2020/wordml/sdtdatahash" xmlns:w16sdtfl="http://schemas.microsoft.com/office/word/2024/wordml/sdtformatlock" xmlns:w16se="http://schemas.microsoft.com/office/word/2015/wordml/symex" xmlns:wpg="http://schemas.microsoft.com/office/word/2010/wordprocessingGroup" xmlns:wpi="http://schemas.microsoft.com/office/word/2010/wordprocessingInk" xmlns:wne="http://schemas.microsoft.com/office/word/2006/wordml" xmlns:wps="http://schemas.microsoft.com/office/word/2010/wordprocessingShape" mc:Ignorable="w14 w15 w16se w16cid w16 w16cex w16sdtdh w16sdtfl w16du wp14">
+<w:document xmlns:wpc="http://schemas.microsoft.com/office/word/2010/wordprocessingCanvas" xmlns:cx="http://schemas.microsoft.com/office/drawing/2014/chartex" xmlns:cx1="http://schemas.microsoft.com/office/drawing/2015/9/8/chartex" xmlns:cx2="http://schemas.microsoft.com/office/drawing/2015/10/21/chartex" xmlns:cx3="http://schemas.microsoft.com/office/drawing/2016/5/9/chartex" xmlns:cx4="http://schemas.microsoft.com/office/drawing/2016/5/10/chartex" xmlns:cx5="http://schemas.microsoft.com/office/drawing/2016/5/11/chartex" xmlns:cx6="http://schemas.microsoft.com/office/drawing/2016/5/12/chartex" xmlns:cx7="http://schemas.microsoft.com/office/drawing/2016/5/13/chartex" xmlns:cx8="http://schemas.microsoft.com/office/drawing/2016/5/14/chartex" xmlns:mc="http://schemas.openxmlformats.org/markup-compatibility/2006" xmlns:aink="http://schemas.microsoft.com/office/drawing/2016/ink" xmlns:am3d="http://schemas.microsoft.com/office/drawing/2017/model3d" xmlns:o="urn:schemas-microsoft-com:office:office" xmlns:r="http://schemas.openxmlformats.org/officeDocument/2006/relationships" xmlns:m="http://schemas.openxmlformats.org/officeDocument/2006/math" xmlns:v="urn:schemas-microsoft-com:vml" xmlns:wp14="http://schemas.microsoft.com/office/word/2010/wordprocessingDrawing" xmlns:wp="http://schemas.openxmlformats.org/drawingml/2006/wordprocessingDrawing" xmlns:w10="urn:schemas-microsoft-com:office:word" xmlns:w="http://schemas.openxmlformats.org/wordprocessingml/2006/main" xmlns:w14="http://schemas.microsoft.com/office/word/2010/wordml" xmlns:w15="http://schemas.microsoft.com/office/word/2012/wordml" xmlns:w16cid="http://schemas.microsoft.com/office/word/2016/wordml/cid" xmlns:w16se="http://schemas.microsoft.com/office/word/2015/wordml/symex" xmlns:wpg="http://schemas.microsoft.com/office/word/2010/wordprocessingGroup" xmlns:wpi="http://schemas.microsoft.com/office/word/2010/wordprocessingInk" xmlns:wne="http://schemas.microsoft.com/office/word/2006/wordml" xmlns:wps="http://schemas.microsoft.com/office/word/2010/wordprocessingShape" mc:Ignorable="w14 w15 w16se w16cid wp14">
   <w:body>
     <w:tbl>
       <w:tblPr>
@@ -181,7 +181,7 @@
                     </wp:anchor>
                   </w:drawing>
                 </mc:Choice>
-                <mc:Fallback>
+                <mc:Fallback xmlns:oel="http://schemas.microsoft.com/office/2019/extlst" xmlns:w16cex="http://schemas.microsoft.com/office/word/2018/wordml/cex" xmlns:w16="http://schemas.microsoft.com/office/word/2018/wordml" xmlns:w16du="http://schemas.microsoft.com/office/word/2023/wordml/word16du" xmlns:w16sdtdh="http://schemas.microsoft.com/office/word/2020/wordml/sdtdatahash" xmlns:w16sdtfl="http://schemas.microsoft.com/office/word/2024/wordml/sdtformatlock">
                   <w:pict>
                     <v:line w14:anchorId="1B35A85B" id="Straight Connector 2000649774" o:spid="_x0000_s1026" style="position:absolute;flip:x;z-index:251661312;visibility:visible;mso-wrap-style:square;mso-wrap-distance-left:9pt;mso-wrap-distance-top:0;mso-wrap-distance-right:9pt;mso-wrap-distance-bottom:0;mso-position-horizontal:absolute;mso-position-horizontal-relative:text;mso-position-vertical:absolute;mso-position-vertical-relative:text" from="51.4pt,3.8pt" to="174.3pt,3.8pt" o:gfxdata="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" strokecolor="black [3213]" strokeweight=".5pt">
                       <v:stroke joinstyle="miter"/>
@@ -273,7 +273,7 @@
                     </wp:anchor>
                   </w:drawing>
                 </mc:Choice>
-                <mc:Fallback>
+                <mc:Fallback xmlns:oel="http://schemas.microsoft.com/office/2019/extlst" xmlns:w16cex="http://schemas.microsoft.com/office/word/2018/wordml/cex" xmlns:w16="http://schemas.microsoft.com/office/word/2018/wordml" xmlns:w16du="http://schemas.microsoft.com/office/word/2023/wordml/word16du" xmlns:w16sdtdh="http://schemas.microsoft.com/office/word/2020/wordml/sdtdatahash" xmlns:w16sdtfl="http://schemas.microsoft.com/office/word/2024/wordml/sdtformatlock">
                   <w:pict>
                     <v:line w14:anchorId="5A9A1170" id="Straight Connector 1463436238" o:spid="_x0000_s1026" style="position:absolute;flip:y;z-index:251660288;visibility:visible;mso-wrap-style:square;mso-width-percent:0;mso-height-percent:0;mso-wrap-distance-left:9pt;mso-wrap-distance-top:0;mso-wrap-distance-right:9pt;mso-wrap-distance-bottom:0;mso-position-horizontal:absolute;mso-position-horizontal-relative:text;mso-position-vertical:absolute;mso-position-vertical-relative:text;mso-width-percent:0;mso-height-percent:0;mso-width-relative:margin;mso-height-relative:margin" from="66.8pt,5.25pt" to="223.7pt,5.25pt" o:gfxdata="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" strokecolor="black [3213]" strokeweight=".5pt">
                       <v:stroke joinstyle="miter"/>
@@ -2589,7 +2589,24 @@
                 <w:sz w:val="12"/>
                 <w:szCs w:val="26"/>
               </w:rPr>
-              <w:t>_________________________________________</w:t>
+              <w:t>___________________</w:t>
+            </w:r>
+            <w:r>
+              <w:rPr>
+                <w:rFonts w:ascii="Times New Roman" w:hAnsi="Times New Roman"/>
+                <w:sz w:val="12"/>
+                <w:szCs w:val="26"/>
+                <w:lang w:val="vi-VN"/>
+              </w:rPr>
+              <w:t>---------------------------------------------</w:t>
+            </w:r>
+            <w:r>
+              <w:rPr>
+                <w:rFonts w:ascii="Times New Roman" w:hAnsi="Times New Roman"/>
+                <w:sz w:val="12"/>
+                <w:szCs w:val="26"/>
+              </w:rPr>
+              <w:t>______________________</w:t>
             </w:r>
           </w:p>
           <w:p>
@@ -2655,7 +2672,24 @@
                 <w:sz w:val="12"/>
                 <w:szCs w:val="26"/>
               </w:rPr>
-              <w:t>__________________________</w:t>
+              <w:t>_____________</w:t>
+            </w:r>
+            <w:r>
+              <w:rPr>
+                <w:rFonts w:ascii="Times New Roman" w:hAnsi="Times New Roman"/>
+                <w:sz w:val="12"/>
+                <w:szCs w:val="26"/>
+                <w:lang w:val="vi-VN"/>
+              </w:rPr>
+              <w:t>-----------------------------------------------------------</w:t>
+            </w:r>
+            <w:r>
+              <w:rPr>
+                <w:rFonts w:ascii="Times New Roman" w:hAnsi="Times New Roman"/>
+                <w:sz w:val="12"/>
+                <w:szCs w:val="26"/>
+              </w:rPr>
+              <w:t>_____________</w:t>
             </w:r>
           </w:p>
           <w:p>
@@ -4014,6 +4048,7 @@
       <w:r>
         <w:rPr>
           <w:rFonts w:ascii="Times New Roman" w:hAnsi="Times New Roman"/>
+          <w:b/>
           <w:sz w:val="28"/>
         </w:rPr>
         <w:t>{{DEDUCTION_TEXT}}</w:t>
@@ -4082,14 +4117,17 @@
         <w:jc w:val="both"/>
         <w:rPr>
           <w:rFonts w:ascii="Times New Roman" w:hAnsi="Times New Roman"/>
-          <w:sz w:val="28"/>
-          <w:szCs w:val="28"/>
-          <w:lang w:val="vi-VN"/>
-        </w:rPr>
-      </w:pPr>
-      <w:r>
-        <w:rPr>
-          <w:rFonts w:ascii="Times New Roman" w:hAnsi="Times New Roman"/>
+          <w:b/>
+          <w:sz w:val="28"/>
+          <w:szCs w:val="28"/>
+          <w:lang w:val="vi-VN"/>
+        </w:rPr>
+      </w:pPr>
+      <w:bookmarkStart w:id="0" w:name="_GoBack"/>
+      <w:r>
+        <w:rPr>
+          <w:rFonts w:ascii="Times New Roman" w:hAnsi="Times New Roman"/>
+          <w:b/>
           <w:sz w:val="28"/>
         </w:rPr>
         <w:t>Tên tài khoản: {{ACCOUNT_OWNER}}</w:t>
@@ -4106,14 +4144,16 @@
         <w:jc w:val="both"/>
         <w:rPr>
           <w:rFonts w:ascii="Times New Roman" w:hAnsi="Times New Roman"/>
-          <w:sz w:val="28"/>
-          <w:szCs w:val="28"/>
-          <w:lang w:val="vi-VN"/>
-        </w:rPr>
-      </w:pPr>
-      <w:r>
-        <w:rPr>
-          <w:rFonts w:ascii="Times New Roman" w:hAnsi="Times New Roman"/>
+          <w:b/>
+          <w:sz w:val="28"/>
+          <w:szCs w:val="28"/>
+          <w:lang w:val="vi-VN"/>
+        </w:rPr>
+      </w:pPr>
+      <w:r>
+        <w:rPr>
+          <w:rFonts w:ascii="Times New Roman" w:hAnsi="Times New Roman"/>
+          <w:b/>
           <w:sz w:val="28"/>
         </w:rPr>
         <w:t>Số tài khoản: {{ACCOUNT_NO}}</w:t>
@@ -4130,19 +4170,22 @@
         <w:jc w:val="both"/>
         <w:rPr>
           <w:rFonts w:ascii="Times New Roman" w:hAnsi="Times New Roman"/>
-          <w:sz w:val="28"/>
-          <w:szCs w:val="28"/>
-          <w:lang w:val="vi-VN"/>
-        </w:rPr>
-      </w:pPr>
-      <w:r>
-        <w:rPr>
-          <w:rFonts w:ascii="Times New Roman" w:hAnsi="Times New Roman"/>
+          <w:b/>
+          <w:sz w:val="28"/>
+          <w:szCs w:val="28"/>
+          <w:lang w:val="vi-VN"/>
+        </w:rPr>
+      </w:pPr>
+      <w:r>
+        <w:rPr>
+          <w:rFonts w:ascii="Times New Roman" w:hAnsi="Times New Roman"/>
+          <w:b/>
           <w:sz w:val="28"/>
         </w:rPr>
         <w:t>Tại ngân hàng: {{BANK_NAME}}</w:t>
       </w:r>
     </w:p>
+    <w:bookmarkEnd w:id="0"/>
     <w:p>
       <w:pPr>
         <w:pStyle w:val="ListParagraph"/>
@@ -4194,7 +4237,16 @@
           <w:szCs w:val="28"/>
           <w:lang w:val="vi-VN"/>
         </w:rPr>
-        <w:t>Trường hợp thay đổi thông tin tài khoản nhận thanh toán, Bên B phải báo trước bằng văn bản cho bên A chậm nhất là 30 ngày trước khi đến hạn của chu kỳ thanh toán kế tiếp và hai bên sẽ tiến hành ký phụ lục điều chỉnh thông tin tài khoản nhận tiền  thanh toán.</w:t>
+        <w:t xml:space="preserve">Trường hợp thay đổi thông tin tài khoản nhận thanh toán, Bên B phải báo trước bằng văn bản cho bên A chậm nhất là 30 ngày trước khi đến hạn của chu kỳ thanh toán kế tiếp và hai bên sẽ tiến hành ký phụ lục điều chỉnh </w:t>
+      </w:r>
+      <w:r>
+        <w:rPr>
+          <w:rFonts w:ascii="Times New Roman" w:hAnsi="Times New Roman"/>
+          <w:sz w:val="28"/>
+          <w:szCs w:val="28"/>
+          <w:lang w:val="vi-VN"/>
+        </w:rPr>
+        <w:t>thông tin tài khoản nhận tiền  thanh toán.</w:t>
       </w:r>
     </w:p>
     <w:p>
@@ -4389,134 +4441,21 @@
             <w:tcW w:w="8640" w:type="dxa"/>
           </w:tcPr>
           <w:p>
+            <w:pPr>
+              <w:rPr>
+                <w:rFonts w:ascii="Times New Roman" w:hAnsi="Times New Roman"/>
+              </w:rPr>
+            </w:pPr>
             <w:r>
+              <w:rPr>
+                <w:rFonts w:ascii="Times New Roman" w:hAnsi="Times New Roman"/>
+              </w:rPr>
               <w:t>{{PAY_ROW}}</w:t>
             </w:r>
           </w:p>
         </w:tc>
       </w:tr>
     </w:tbl>
-    <w:p>
-      <w:pPr>
-        <w:jc w:val="both"/>
-        <w:rPr>
-          <w:rFonts w:ascii="Times New Roman" w:hAnsi="Times New Roman"/>
-          <w:b/>
-          <w:bCs/>
-          <w:sz w:val="28"/>
-          <w:szCs w:val="28"/>
-          <w:lang w:val="en-SG" w:eastAsia="en-SG"/>
-        </w:rPr>
-      </w:pPr>
-      <w:r>
-        <w:rPr>
-          <w:rFonts w:ascii="Times New Roman" w:hAnsi="Times New Roman"/>
-          <w:b/>
-          <w:bCs/>
-          <w:i/>
-          <w:sz w:val="28"/>
-          <w:szCs w:val="28"/>
-          <w:lang w:val="en-SG"/>
-        </w:rPr>
-        <w:t xml:space="preserve">                                                               </w:t>
-      </w:r>
-      <w:r>
-        <w:rPr>
-          <w:b/>
-          <w:bCs/>
-          <w:sz w:val="28"/>
-          <w:szCs w:val="28"/>
-          <w:lang w:val="vi-VN"/>
-        </w:rPr>
-        <w:t>T</w:t>
-      </w:r>
-      <w:r>
-        <w:rPr>
-          <w:rFonts w:ascii="Cambria" w:hAnsi="Cambria" w:cs="Cambria"/>
-          <w:b/>
-          <w:bCs/>
-          <w:sz w:val="28"/>
-          <w:szCs w:val="28"/>
-          <w:lang w:val="vi-VN"/>
-        </w:rPr>
-        <w:t>ổ</w:t>
-      </w:r>
-      <w:r>
-        <w:rPr>
-          <w:b/>
-          <w:bCs/>
-          <w:sz w:val="28"/>
-          <w:szCs w:val="28"/>
-          <w:lang w:val="vi-VN"/>
-        </w:rPr>
-        <w:t>ng c</w:t>
-      </w:r>
-      <w:r>
-        <w:rPr>
-          <w:rFonts w:ascii="Cambria" w:hAnsi="Cambria" w:cs="Cambria"/>
-          <w:b/>
-          <w:bCs/>
-          <w:sz w:val="28"/>
-          <w:szCs w:val="28"/>
-          <w:lang w:val="vi-VN"/>
-        </w:rPr>
-        <w:t>ộ</w:t>
-      </w:r>
-      <w:r>
-        <w:rPr>
-          <w:b/>
-          <w:bCs/>
-          <w:sz w:val="28"/>
-          <w:szCs w:val="28"/>
-          <w:lang w:val="vi-VN"/>
-        </w:rPr>
-        <w:t xml:space="preserve">ng:             </w:t>
-      </w:r>
-      <w:r>
-        <w:rPr>
-          <w:rFonts w:ascii="Times New Roman" w:hAnsi="Times New Roman"/>
-          <w:b/>
-          <w:bCs/>
-          <w:sz w:val="28"/>
-          <w:szCs w:val="28"/>
-          <w:lang w:val="en-SG" w:eastAsia="en-SG"/>
-        </w:rPr>
-        <w:t>142</w:t>
-      </w:r>
-      <w:r>
-        <w:rPr>
-          <w:rFonts w:ascii="Times New Roman" w:hAnsi="Times New Roman"/>
-          <w:b/>
-          <w:bCs/>
-          <w:sz w:val="28"/>
-          <w:szCs w:val="28"/>
-          <w:lang w:val="en-SG" w:eastAsia="en-SG"/>
-        </w:rPr>
-        <w:t>.</w:t>
-      </w:r>
-      <w:r>
-        <w:rPr>
-          <w:rFonts w:ascii="Times New Roman" w:hAnsi="Times New Roman"/>
-          <w:b/>
-          <w:bCs/>
-          <w:sz w:val="28"/>
-          <w:szCs w:val="28"/>
-          <w:lang w:val="en-SG" w:eastAsia="en-SG"/>
-        </w:rPr>
-        <w:t>8</w:t>
-      </w:r>
-      <w:r>
-        <w:rPr>
-          <w:rFonts w:ascii="Times New Roman" w:hAnsi="Times New Roman"/>
-          <w:b/>
-          <w:bCs/>
-          <w:sz w:val="28"/>
-          <w:szCs w:val="28"/>
-          <w:lang w:val="en-SG" w:eastAsia="en-SG"/>
-        </w:rPr>
-        <w:t>00.000</w:t>
-      </w:r>
-    </w:p>
     <w:p>
       <w:pPr>
         <w:pStyle w:val="ListParagraph"/>
@@ -4857,6 +4796,9 @@
               </w:rPr>
             </w:pPr>
             <w:r>
+              <w:rPr>
+                <w:rFonts w:ascii="Times New Roman" w:hAnsi="Times New Roman"/>
+              </w:rPr>
               <w:t>{{OWNER_NAME}}</w:t>
             </w:r>
           </w:p>
@@ -4915,7 +4857,7 @@
 </file>
 
 <file path=word/numbering.xml><?xml version="1.0" encoding="utf-8"?>
-<w:numbering xmlns:wpc="http://schemas.microsoft.com/office/word/2010/wordprocessingCanvas" xmlns:cx="http://schemas.microsoft.com/office/drawing/2014/chartex" xmlns:cx1="http://schemas.microsoft.com/office/drawing/2015/9/8/chartex" xmlns:cx2="http://schemas.microsoft.com/office/drawing/2015/10/21/chartex" xmlns:cx3="http://schemas.microsoft.com/office/drawing/2016/5/9/chartex" xmlns:cx4="http://schemas.microsoft.com/office/drawing/2016/5/10/chartex" xmlns:cx5="http://schemas.microsoft.com/office/drawing/2016/5/11/chartex" xmlns:cx6="http://schemas.microsoft.com/office/drawing/2016/5/12/chartex" xmlns:cx7="http://schemas.microsoft.com/office/drawing/2016/5/13/chartex" xmlns:cx8="http://schemas.microsoft.com/office/drawing/2016/5/14/chartex" xmlns:mc="http://schemas.openxmlformats.org/markup-compatibility/2006" xmlns:aink="http://schemas.microsoft.com/office/drawing/2016/ink" xmlns:am3d="http://schemas.microsoft.com/office/drawing/2017/model3d" xmlns:o="urn:schemas-microsoft-com:office:office" xmlns:oel="http://schemas.microsoft.com/office/2019/extlst" xmlns:r="http://schemas.openxmlformats.org/officeDocument/2006/relationships" xmlns:m="http://schemas.openxmlformats.org/officeDocument/2006/math" xmlns:v="urn:schemas-microsoft-com:vml" xmlns:wp14="http://schemas.microsoft.com/office/word/2010/wordprocessingDrawing" xmlns:wp="http://schemas.openxmlformats.org/drawingml/2006/wordprocessingDrawing" xmlns:w10="urn:schemas-microsoft-com:office:word" xmlns:w="http://schemas.openxmlformats.org/wordprocessingml/2006/main" xmlns:w14="http://schemas.microsoft.com/office/word/2010/wordml" xmlns:w15="http://schemas.microsoft.com/office/word/2012/wordml" xmlns:w16cex="http://schemas.microsoft.com/office/word/2018/wordml/cex" xmlns:w16cid="http://schemas.microsoft.com/office/word/2016/wordml/cid" xmlns:w16="http://schemas.microsoft.com/office/word/2018/wordml" xmlns:w16du="http://schemas.microsoft.com/office/word/2023/wordml/word16du" xmlns:w16sdtdh="http://schemas.microsoft.com/office/word/2020/wordml/sdtdatahash" xmlns:w16sdtfl="http://schemas.microsoft.com/office/word/2024/wordml/sdtformatlock" xmlns:w16se="http://schemas.microsoft.com/office/word/2015/wordml/symex" xmlns:wpg="http://schemas.microsoft.com/office/word/2010/wordprocessingGroup" xmlns:wpi="http://schemas.microsoft.com/office/word/2010/wordprocessingInk" xmlns:wne="http://schemas.microsoft.com/office/word/2006/wordml" xmlns:wps="http://schemas.microsoft.com/office/word/2010/wordprocessingShape" mc:Ignorable="w14 w15 w16se w16cid w16 w16cex w16sdtdh w16sdtfl w16du wp14">
+<w:numbering xmlns:wpc="http://schemas.microsoft.com/office/word/2010/wordprocessingCanvas" xmlns:cx="http://schemas.microsoft.com/office/drawing/2014/chartex" xmlns:cx1="http://schemas.microsoft.com/office/drawing/2015/9/8/chartex" xmlns:cx2="http://schemas.microsoft.com/office/drawing/2015/10/21/chartex" xmlns:cx3="http://schemas.microsoft.com/office/drawing/2016/5/9/chartex" xmlns:cx4="http://schemas.microsoft.com/office/drawing/2016/5/10/chartex" xmlns:cx5="http://schemas.microsoft.com/office/drawing/2016/5/11/chartex" xmlns:cx6="http://schemas.microsoft.com/office/drawing/2016/5/12/chartex" xmlns:cx7="http://schemas.microsoft.com/office/drawing/2016/5/13/chartex" xmlns:cx8="http://schemas.microsoft.com/office/drawing/2016/5/14/chartex" xmlns:mc="http://schemas.openxmlformats.org/markup-compatibility/2006" xmlns:aink="http://schemas.microsoft.com/office/drawing/2016/ink" xmlns:am3d="http://schemas.microsoft.com/office/drawing/2017/model3d" xmlns:o="urn:schemas-microsoft-com:office:office" xmlns:r="http://schemas.openxmlformats.org/officeDocument/2006/relationships" xmlns:m="http://schemas.openxmlformats.org/officeDocument/2006/math" xmlns:v="urn:schemas-microsoft-com:vml" xmlns:wp14="http://schemas.microsoft.com/office/word/2010/wordprocessingDrawing" xmlns:wp="http://schemas.openxmlformats.org/drawingml/2006/wordprocessingDrawing" xmlns:w10="urn:schemas-microsoft-com:office:word" xmlns:w="http://schemas.openxmlformats.org/wordprocessingml/2006/main" xmlns:w14="http://schemas.microsoft.com/office/word/2010/wordml" xmlns:w15="http://schemas.microsoft.com/office/word/2012/wordml" xmlns:w16cid="http://schemas.microsoft.com/office/word/2016/wordml/cid" xmlns:w16se="http://schemas.microsoft.com/office/word/2015/wordml/symex" xmlns:wpg="http://schemas.microsoft.com/office/word/2010/wordprocessingGroup" xmlns:wpi="http://schemas.microsoft.com/office/word/2010/wordprocessingInk" xmlns:wne="http://schemas.microsoft.com/office/word/2006/wordml" xmlns:wps="http://schemas.microsoft.com/office/word/2010/wordprocessingShape" mc:Ignorable="w14 w15 w16se w16cid wp14">
   <w:abstractNum w:abstractNumId="0" w15:restartNumberingAfterBreak="1">
     <w:nsid w:val="084E5937"/>
     <w:multiLevelType w:val="hybridMultilevel"/>
@@ -6099,44 +6041,44 @@
       </w:pPr>
     </w:lvl>
   </w:abstractNum>
-  <w:num w:numId="1" w16cid:durableId="2030326912">
+  <w:num w:numId="1">
     <w:abstractNumId w:val="5"/>
   </w:num>
-  <w:num w:numId="2" w16cid:durableId="1411318656">
+  <w:num w:numId="2">
     <w:abstractNumId w:val="3"/>
   </w:num>
-  <w:num w:numId="3" w16cid:durableId="1322781673">
+  <w:num w:numId="3">
     <w:abstractNumId w:val="6"/>
   </w:num>
-  <w:num w:numId="4" w16cid:durableId="1403216599">
+  <w:num w:numId="4">
     <w:abstractNumId w:val="7"/>
   </w:num>
-  <w:num w:numId="5" w16cid:durableId="366836286">
+  <w:num w:numId="5">
     <w:abstractNumId w:val="4"/>
   </w:num>
-  <w:num w:numId="6" w16cid:durableId="747656066">
+  <w:num w:numId="6">
     <w:abstractNumId w:val="9"/>
   </w:num>
-  <w:num w:numId="7" w16cid:durableId="379793347">
+  <w:num w:numId="7">
     <w:abstractNumId w:val="0"/>
   </w:num>
-  <w:num w:numId="8" w16cid:durableId="279535789">
+  <w:num w:numId="8">
     <w:abstractNumId w:val="2"/>
   </w:num>
-  <w:num w:numId="9" w16cid:durableId="1675181477">
+  <w:num w:numId="9">
     <w:abstractNumId w:val="1"/>
   </w:num>
-  <w:num w:numId="10" w16cid:durableId="1109930977">
+  <w:num w:numId="10">
     <w:abstractNumId w:val="10"/>
   </w:num>
-  <w:num w:numId="11" w16cid:durableId="1749038798">
+  <w:num w:numId="11">
     <w:abstractNumId w:val="8"/>
   </w:num>
 </w:numbering>
 </file>
 
 <file path=word/styles.xml><?xml version="1.0" encoding="utf-8"?>
-<w:styles xmlns:mc="http://schemas.openxmlformats.org/markup-compatibility/2006" xmlns:r="http://schemas.openxmlformats.org/officeDocument/2006/relationships" xmlns:w="http://schemas.openxmlformats.org/wordprocessingml/2006/main" xmlns:w14="http://schemas.microsoft.com/office/word/2010/wordml" xmlns:w15="http://schemas.microsoft.com/office/word/2012/wordml" xmlns:w16cex="http://schemas.microsoft.com/office/word/2018/wordml/cex" xmlns:w16cid="http://schemas.microsoft.com/office/word/2016/wordml/cid" xmlns:w16="http://schemas.microsoft.com/office/word/2018/wordml" xmlns:w16du="http://schemas.microsoft.com/office/word/2023/wordml/word16du" xmlns:w16sdtdh="http://schemas.microsoft.com/office/word/2020/wordml/sdtdatahash" xmlns:w16sdtfl="http://schemas.microsoft.com/office/word/2024/wordml/sdtformatlock" xmlns:w16se="http://schemas.microsoft.com/office/word/2015/wordml/symex" mc:Ignorable="w14 w15 w16se w16cid w16 w16cex w16sdtdh w16sdtfl w16du">
+<w:styles xmlns:mc="http://schemas.openxmlformats.org/markup-compatibility/2006" xmlns:r="http://schemas.openxmlformats.org/officeDocument/2006/relationships" xmlns:w="http://schemas.openxmlformats.org/wordprocessingml/2006/main" xmlns:w14="http://schemas.microsoft.com/office/word/2010/wordml" xmlns:w15="http://schemas.microsoft.com/office/word/2012/wordml" xmlns:w16cid="http://schemas.microsoft.com/office/word/2016/wordml/cid" xmlns:w16se="http://schemas.microsoft.com/office/word/2015/wordml/symex" mc:Ignorable="w14 w15 w16se w16cid">
   <w:docDefaults>
     <w:rPrDefault>
       <w:rPr>
@@ -6154,7 +6096,7 @@
       </w:pPr>
     </w:pPrDefault>
   </w:docDefaults>
-  <w:latentStyles w:defLockedState="0" w:defUIPriority="99" w:defSemiHidden="0" w:defUnhideWhenUsed="0" w:defQFormat="0" w:count="376">
+  <w:latentStyles w:defLockedState="0" w:defUIPriority="99" w:defSemiHidden="0" w:defUnhideWhenUsed="0" w:defQFormat="0" w:count="375">
     <w:lsdException w:name="Normal" w:uiPriority="0" w:qFormat="1"/>
     <w:lsdException w:name="heading 1" w:uiPriority="9" w:qFormat="1"/>
     <w:lsdException w:name="heading 2" w:semiHidden="1" w:uiPriority="9" w:unhideWhenUsed="1" w:qFormat="1"/>
@@ -6530,7 +6472,6 @@
     <w:lsdException w:name="Smart Hyperlink" w:semiHidden="1" w:unhideWhenUsed="1"/>
     <w:lsdException w:name="Hashtag" w:semiHidden="1" w:unhideWhenUsed="1"/>
     <w:lsdException w:name="Unresolved Mention" w:semiHidden="1" w:unhideWhenUsed="1"/>
-    <w:lsdException w:name="Smart Link" w:semiHidden="1" w:unhideWhenUsed="1"/>
   </w:latentStyles>
   <w:style w:type="paragraph" w:default="1" w:styleId="Normal">
     <w:name w:val="Normal"/>

</xml_diff>

<commit_message>
Bold required fields in templates and update generation script
</commit_message>
<xml_diff>
--- a/templates/MASTER_TEMPLATE_VFINAL.docx
+++ b/templates/MASTER_TEMPLATE_VFINAL.docx
@@ -711,6 +711,7 @@
       <w:r>
         <w:rPr>
           <w:rFonts w:ascii="Times New Roman" w:hAnsi="Times New Roman"/>
+          <w:b/>
           <w:sz w:val="28"/>
         </w:rPr>
         <w:t>Căn cứ hợp đồng số {{CONTRACT_NO}} ký ngày {{CONTRACT_DATE}} giữa Trung tâm Mạng lưới MobiFone miền Nam và Ông/Bà {{OWNER_NAME}} về việc thuê đặt trạm BTS địa chỉ: {{ADDRESS_OLD}} ({{ADDRESS_NEW}}).</w:t>
@@ -2803,6 +2804,7 @@
       <w:r>
         <w:rPr>
           <w:rFonts w:ascii="Times New Roman" w:hAnsi="Times New Roman"/>
+          <w:b/>
           <w:sz w:val="28"/>
         </w:rPr>
         <w:t>Căn cứ hợp đồng số {{CONTRACT_NO}} ký ngày {{CONTRACT_DATE}} giữa Trung tâm Mạng lưới MobiFone miền Nam và Ông/Bà {{OWNER_NAME}} về việc thuê đặt trạm BTS địa chỉ: {{ADDRESS_OLD}} ({{ADDRESS_NEW}}).</w:t>
@@ -4099,6 +4101,7 @@
       <w:r>
         <w:rPr>
           <w:rFonts w:ascii="Times New Roman" w:hAnsi="Times New Roman"/>
+          <w:b/>
           <w:sz w:val="28"/>
           <w:szCs w:val="28"/>
           <w:lang w:val="vi-VN"/>
@@ -4798,6 +4801,7 @@
             <w:r>
               <w:rPr>
                 <w:rFonts w:ascii="Times New Roman" w:hAnsi="Times New Roman"/>
+                <w:b/>
               </w:rPr>
               <w:t>{{OWNER_NAME}}</w:t>
             </w:r>

</xml_diff>